<commit_message>
Update to Ethical Review Application
</commit_message>
<xml_diff>
--- a/memory/ethics/Ethical Review Application Form.docx
+++ b/memory/ethics/Ethical Review Application Form.docx
@@ -707,27 +707,7 @@
                 <w:szCs w:val="20"/>
                 <w:lang w:eastAsia="en-GB"/>
               </w:rPr>
-              <w:t xml:space="preserve">This project is a follow-up study to the previously approved experiment </w:t>
-            </w:r>
-            <w:proofErr w:type="spellStart"/>
-            <w:r>
-              <w:rPr>
-                <w:rFonts w:ascii="Calibri" w:eastAsia="Times New Roman" w:hAnsi="Calibri" w:cs="Calibri"/>
-                <w:sz w:val="20"/>
-                <w:szCs w:val="20"/>
-                <w:lang w:eastAsia="en-GB"/>
-              </w:rPr>
-              <w:t>FakeArt</w:t>
-            </w:r>
-            <w:proofErr w:type="spellEnd"/>
-            <w:r>
-              <w:rPr>
-                <w:rFonts w:ascii="Calibri" w:eastAsia="Times New Roman" w:hAnsi="Calibri" w:cs="Calibri"/>
-                <w:sz w:val="20"/>
-                <w:szCs w:val="20"/>
-                <w:lang w:eastAsia="en-GB"/>
-              </w:rPr>
-              <w:t xml:space="preserve"> (ER/OO382/1). This study will investigate how </w:t>
+              <w:t xml:space="preserve">This project is a follow-up study to the previously approved experiment FakeArt (ER/OO382/1). This study will investigate how </w:t>
             </w:r>
             <w:r>
               <w:rPr>
@@ -783,7 +763,6 @@
                 <w:color w:val="000000" w:themeColor="text1"/>
                 <w:sz w:val="20"/>
                 <w:szCs w:val="20"/>
-                <w:highlight w:val="yellow"/>
                 <w:lang w:eastAsia="en-GB"/>
               </w:rPr>
               <w:t>seen in the previous experiment</w:t>
@@ -794,7 +773,6 @@
                 <w:color w:val="000000" w:themeColor="text1"/>
                 <w:sz w:val="20"/>
                 <w:szCs w:val="20"/>
-                <w:highlight w:val="yellow"/>
                 <w:lang w:eastAsia="en-GB"/>
               </w:rPr>
               <w:t>,</w:t>
@@ -805,7 +783,6 @@
                 <w:color w:val="000000" w:themeColor="text1"/>
                 <w:sz w:val="20"/>
                 <w:szCs w:val="20"/>
-                <w:highlight w:val="yellow"/>
                 <w:lang w:eastAsia="en-GB"/>
               </w:rPr>
               <w:t xml:space="preserve"> mixed with new artworks.</w:t>
@@ -818,7 +795,177 @@
                 <w:szCs w:val="20"/>
                 <w:lang w:eastAsia="en-GB"/>
               </w:rPr>
-              <w:t xml:space="preserve"> Participants will have to discriminate new items from old and recall the context of presentation of each item (whether the artwork was labelled as Original, AI-Generated or a Forgery). This research contributes to understanding how aesthetic judgments interact with cognitive processes such as recognition and attribution, particularly in the context of </w:t>
+              <w:t xml:space="preserve"> Participants will have to discriminate new items from old and recall the context of </w:t>
+            </w:r>
+            <w:r>
+              <w:rPr>
+                <w:rFonts w:ascii="Calibri" w:eastAsia="Times New Roman" w:hAnsi="Calibri" w:cs="Calibri"/>
+                <w:color w:val="000000" w:themeColor="text1"/>
+                <w:sz w:val="20"/>
+                <w:szCs w:val="20"/>
+                <w:lang w:eastAsia="en-GB"/>
+              </w:rPr>
+              <w:t xml:space="preserve">the </w:t>
+            </w:r>
+            <w:r>
+              <w:rPr>
+                <w:rFonts w:ascii="Calibri" w:eastAsia="Times New Roman" w:hAnsi="Calibri" w:cs="Calibri"/>
+                <w:color w:val="000000" w:themeColor="text1"/>
+                <w:sz w:val="20"/>
+                <w:szCs w:val="20"/>
+                <w:lang w:eastAsia="en-GB"/>
+              </w:rPr>
+              <w:t>presentation of each item (whether the artwork was labelled as Original</w:t>
+            </w:r>
+            <w:r>
+              <w:rPr>
+                <w:rFonts w:ascii="Calibri" w:eastAsia="Times New Roman" w:hAnsi="Calibri" w:cs="Calibri"/>
+                <w:color w:val="000000" w:themeColor="text1"/>
+                <w:sz w:val="20"/>
+                <w:szCs w:val="20"/>
+                <w:lang w:eastAsia="en-GB"/>
+              </w:rPr>
+              <w:t>/</w:t>
+            </w:r>
+            <w:r>
+              <w:rPr>
+                <w:rFonts w:ascii="Calibri" w:eastAsia="Times New Roman" w:hAnsi="Calibri" w:cs="Calibri"/>
+                <w:color w:val="000000" w:themeColor="text1"/>
+                <w:sz w:val="20"/>
+                <w:szCs w:val="20"/>
+                <w:lang w:eastAsia="en-GB"/>
+              </w:rPr>
+              <w:t>AI-Generated</w:t>
+            </w:r>
+            <w:r>
+              <w:rPr>
+                <w:rFonts w:ascii="Calibri" w:eastAsia="Times New Roman" w:hAnsi="Calibri" w:cs="Calibri"/>
+                <w:color w:val="000000" w:themeColor="text1"/>
+                <w:sz w:val="20"/>
+                <w:szCs w:val="20"/>
+                <w:lang w:eastAsia="en-GB"/>
+              </w:rPr>
+              <w:t>/</w:t>
+            </w:r>
+            <w:r>
+              <w:rPr>
+                <w:rFonts w:ascii="Calibri" w:eastAsia="Times New Roman" w:hAnsi="Calibri" w:cs="Calibri"/>
+                <w:color w:val="000000" w:themeColor="text1"/>
+                <w:sz w:val="20"/>
+                <w:szCs w:val="20"/>
+                <w:lang w:eastAsia="en-GB"/>
+              </w:rPr>
+              <w:t xml:space="preserve">Human </w:t>
+            </w:r>
+            <w:r>
+              <w:rPr>
+                <w:rFonts w:ascii="Calibri" w:eastAsia="Times New Roman" w:hAnsi="Calibri" w:cs="Calibri"/>
+                <w:color w:val="000000" w:themeColor="text1"/>
+                <w:sz w:val="20"/>
+                <w:szCs w:val="20"/>
+                <w:lang w:eastAsia="en-GB"/>
+              </w:rPr>
+              <w:t>Forgery</w:t>
+            </w:r>
+            <w:r>
+              <w:rPr>
+                <w:rFonts w:ascii="Calibri" w:eastAsia="Times New Roman" w:hAnsi="Calibri" w:cs="Calibri"/>
+                <w:color w:val="000000" w:themeColor="text1"/>
+                <w:sz w:val="20"/>
+                <w:szCs w:val="20"/>
+                <w:lang w:eastAsia="en-GB"/>
+              </w:rPr>
+              <w:t>, as per a reality beliefs modulation in the previous study</w:t>
+            </w:r>
+            <w:r>
+              <w:rPr>
+                <w:rFonts w:ascii="Calibri" w:eastAsia="Times New Roman" w:hAnsi="Calibri" w:cs="Calibri"/>
+                <w:color w:val="000000" w:themeColor="text1"/>
+                <w:sz w:val="20"/>
+                <w:szCs w:val="20"/>
+                <w:lang w:eastAsia="en-GB"/>
+              </w:rPr>
+              <w:t>)</w:t>
+            </w:r>
+            <w:r>
+              <w:rPr>
+                <w:rFonts w:ascii="Calibri" w:eastAsia="Times New Roman" w:hAnsi="Calibri" w:cs="Calibri"/>
+                <w:color w:val="000000" w:themeColor="text1"/>
+                <w:sz w:val="20"/>
+                <w:szCs w:val="20"/>
+                <w:lang w:eastAsia="en-GB"/>
+              </w:rPr>
+              <w:t xml:space="preserve"> </w:t>
+            </w:r>
+            <w:r>
+              <w:rPr>
+                <w:rFonts w:ascii="Calibri" w:eastAsia="Times New Roman" w:hAnsi="Calibri" w:cs="Calibri"/>
+                <w:color w:val="000000" w:themeColor="text1"/>
+                <w:sz w:val="20"/>
+                <w:szCs w:val="20"/>
+                <w:lang w:eastAsia="en-GB"/>
+              </w:rPr>
+              <w:t>and recall</w:t>
+            </w:r>
+            <w:r>
+              <w:rPr>
+                <w:rFonts w:ascii="Calibri" w:eastAsia="Times New Roman" w:hAnsi="Calibri" w:cs="Calibri"/>
+                <w:color w:val="000000" w:themeColor="text1"/>
+                <w:sz w:val="20"/>
+                <w:szCs w:val="20"/>
+                <w:lang w:eastAsia="en-GB"/>
+              </w:rPr>
+              <w:t xml:space="preserve"> their </w:t>
+            </w:r>
+            <w:r>
+              <w:rPr>
+                <w:rFonts w:ascii="Calibri" w:eastAsia="Times New Roman" w:hAnsi="Calibri" w:cs="Calibri"/>
+                <w:color w:val="000000" w:themeColor="text1"/>
+                <w:sz w:val="20"/>
+                <w:szCs w:val="20"/>
+                <w:lang w:eastAsia="en-GB"/>
+              </w:rPr>
+              <w:t xml:space="preserve">previous </w:t>
+            </w:r>
+            <w:r>
+              <w:rPr>
+                <w:rFonts w:ascii="Calibri" w:eastAsia="Times New Roman" w:hAnsi="Calibri" w:cs="Calibri"/>
+                <w:color w:val="000000" w:themeColor="text1"/>
+                <w:sz w:val="20"/>
+                <w:szCs w:val="20"/>
+                <w:lang w:eastAsia="en-GB"/>
+              </w:rPr>
+              <w:t>subjective reality beliefs about each artwork (tested in the p</w:t>
+            </w:r>
+            <w:r>
+              <w:rPr>
+                <w:rFonts w:ascii="Calibri" w:eastAsia="Times New Roman" w:hAnsi="Calibri" w:cs="Calibri"/>
+                <w:color w:val="000000" w:themeColor="text1"/>
+                <w:sz w:val="20"/>
+                <w:szCs w:val="20"/>
+                <w:lang w:eastAsia="en-GB"/>
+              </w:rPr>
+              <w:t>rior</w:t>
+            </w:r>
+            <w:r>
+              <w:rPr>
+                <w:rFonts w:ascii="Calibri" w:eastAsia="Times New Roman" w:hAnsi="Calibri" w:cs="Calibri"/>
+                <w:color w:val="000000" w:themeColor="text1"/>
+                <w:sz w:val="20"/>
+                <w:szCs w:val="20"/>
+                <w:lang w:eastAsia="en-GB"/>
+              </w:rPr>
+              <w:t xml:space="preserve"> experiment using two scales: AI-Generated vs Human Creation and Copy/Forgery vs Original Creation).</w:t>
+            </w:r>
+            <w:r>
+              <w:rPr>
+                <w:rFonts w:ascii="Calibri" w:eastAsia="Times New Roman" w:hAnsi="Calibri" w:cs="Calibri"/>
+                <w:color w:val="000000" w:themeColor="text1"/>
+                <w:sz w:val="20"/>
+                <w:szCs w:val="20"/>
+                <w:lang w:eastAsia="en-GB"/>
+              </w:rPr>
+              <w:t xml:space="preserve"> This research contributes to understanding how aesthetic judgments interact with cognitive processes such as recognition and attribution, particularly in the context of </w:t>
             </w:r>
             <w:r>
               <w:rPr>
@@ -854,83 +1001,77 @@
                 <w:szCs w:val="20"/>
                 <w:lang w:eastAsia="en-GB"/>
               </w:rPr>
-              <w:t xml:space="preserve">This online experiment will be set up on Prolific (where the bulk of the recruitment for the previous experiment happened) and will be only open </w:t>
-            </w:r>
-            <w:del w:id="0" w:author="Dominique Makowski" w:date="2025-09-15T09:08:00Z" w16du:dateUtc="2025-09-15T08:08:00Z">
-              <w:r>
-                <w:rPr>
-                  <w:rFonts w:ascii="Calibri" w:eastAsia="Times New Roman" w:hAnsi="Calibri" w:cs="Calibri"/>
-                  <w:color w:val="000000" w:themeColor="text1"/>
-                  <w:sz w:val="20"/>
-                  <w:szCs w:val="20"/>
-                  <w:lang w:eastAsia="en-GB"/>
-                </w:rPr>
-                <w:delText>(via Prolific’s inclusion filters)</w:delText>
-              </w:r>
-            </w:del>
-            <w:r>
-              <w:rPr>
-                <w:rFonts w:ascii="Calibri" w:eastAsia="Times New Roman" w:hAnsi="Calibri" w:cs="Calibri"/>
-                <w:color w:val="000000" w:themeColor="text1"/>
-                <w:sz w:val="20"/>
-                <w:szCs w:val="20"/>
-                <w:lang w:eastAsia="en-GB"/>
-              </w:rPr>
-              <w:t xml:space="preserve"> to participants that completed the previous experiment</w:t>
-            </w:r>
-            <w:ins w:id="1" w:author="Dominique Makowski" w:date="2025-09-15T09:08:00Z" w16du:dateUtc="2025-09-15T08:08:00Z">
-              <w:r>
-                <w:rPr>
-                  <w:rFonts w:ascii="Calibri" w:eastAsia="Times New Roman" w:hAnsi="Calibri" w:cs="Calibri"/>
-                  <w:color w:val="000000" w:themeColor="text1"/>
-                  <w:sz w:val="20"/>
-                  <w:szCs w:val="20"/>
-                  <w:lang w:eastAsia="en-GB"/>
-                </w:rPr>
-                <w:t xml:space="preserve"> </w:t>
-              </w:r>
-              <w:r>
-                <w:rPr>
-                  <w:rFonts w:ascii="Calibri" w:eastAsia="Times New Roman" w:hAnsi="Calibri" w:cs="Calibri"/>
-                  <w:color w:val="000000" w:themeColor="text1"/>
-                  <w:sz w:val="20"/>
-                  <w:szCs w:val="20"/>
-                  <w:lang w:eastAsia="en-GB"/>
-                </w:rPr>
-                <w:t xml:space="preserve">via </w:t>
-              </w:r>
-              <w:proofErr w:type="spellStart"/>
-              <w:r>
-                <w:rPr>
-                  <w:rFonts w:ascii="Calibri" w:eastAsia="Times New Roman" w:hAnsi="Calibri" w:cs="Calibri"/>
-                  <w:color w:val="000000" w:themeColor="text1"/>
-                  <w:sz w:val="20"/>
-                  <w:szCs w:val="20"/>
-                  <w:lang w:eastAsia="en-GB"/>
-                </w:rPr>
-                <w:t>Prolific’s</w:t>
-              </w:r>
-              <w:proofErr w:type="spellEnd"/>
-              <w:r>
-                <w:rPr>
-                  <w:rFonts w:ascii="Calibri" w:eastAsia="Times New Roman" w:hAnsi="Calibri" w:cs="Calibri"/>
-                  <w:color w:val="000000" w:themeColor="text1"/>
-                  <w:sz w:val="20"/>
-                  <w:szCs w:val="20"/>
-                  <w:lang w:eastAsia="en-GB"/>
-                </w:rPr>
-                <w:t xml:space="preserve"> inclusion filters</w:t>
-              </w:r>
-            </w:ins>
-            <w:r>
-              <w:rPr>
-                <w:rFonts w:ascii="Calibri" w:eastAsia="Times New Roman" w:hAnsi="Calibri" w:cs="Calibri"/>
-                <w:color w:val="000000" w:themeColor="text1"/>
-                <w:sz w:val="20"/>
-                <w:szCs w:val="20"/>
-                <w:lang w:eastAsia="en-GB"/>
-              </w:rPr>
-              <w:t xml:space="preserve">. </w:t>
+              <w:t xml:space="preserve">This online experiment will be set up on Prolific (where the bulk of the recruitment for the previous experiment happened) and will </w:t>
+            </w:r>
+            <w:r>
+              <w:rPr>
+                <w:rFonts w:ascii="Calibri" w:eastAsia="Times New Roman" w:hAnsi="Calibri" w:cs="Calibri"/>
+                <w:color w:val="000000" w:themeColor="text1"/>
+                <w:sz w:val="20"/>
+                <w:szCs w:val="20"/>
+                <w:lang w:eastAsia="en-GB"/>
+              </w:rPr>
+              <w:t xml:space="preserve">only </w:t>
+            </w:r>
+            <w:r>
+              <w:rPr>
+                <w:rFonts w:ascii="Calibri" w:eastAsia="Times New Roman" w:hAnsi="Calibri" w:cs="Calibri"/>
+                <w:color w:val="000000" w:themeColor="text1"/>
+                <w:sz w:val="20"/>
+                <w:szCs w:val="20"/>
+                <w:lang w:eastAsia="en-GB"/>
+              </w:rPr>
+              <w:t xml:space="preserve">be open to participants </w:t>
+            </w:r>
+            <w:r>
+              <w:rPr>
+                <w:rFonts w:ascii="Calibri" w:eastAsia="Times New Roman" w:hAnsi="Calibri" w:cs="Calibri"/>
+                <w:color w:val="000000" w:themeColor="text1"/>
+                <w:sz w:val="20"/>
+                <w:szCs w:val="20"/>
+                <w:lang w:eastAsia="en-GB"/>
+              </w:rPr>
+              <w:t xml:space="preserve">who </w:t>
+            </w:r>
+            <w:r>
+              <w:rPr>
+                <w:rFonts w:ascii="Calibri" w:eastAsia="Times New Roman" w:hAnsi="Calibri" w:cs="Calibri"/>
+                <w:color w:val="000000" w:themeColor="text1"/>
+                <w:sz w:val="20"/>
+                <w:szCs w:val="20"/>
+                <w:lang w:eastAsia="en-GB"/>
+              </w:rPr>
+              <w:t>completed the previous experiment</w:t>
+            </w:r>
+            <w:r>
+              <w:rPr>
+                <w:rFonts w:ascii="Calibri" w:eastAsia="Times New Roman" w:hAnsi="Calibri" w:cs="Calibri"/>
+                <w:color w:val="000000" w:themeColor="text1"/>
+                <w:sz w:val="20"/>
+                <w:szCs w:val="20"/>
+                <w:lang w:eastAsia="en-GB"/>
+              </w:rPr>
+              <w:t xml:space="preserve"> </w:t>
+            </w:r>
+            <w:r>
+              <w:rPr>
+                <w:rFonts w:ascii="Calibri" w:eastAsia="Times New Roman" w:hAnsi="Calibri" w:cs="Calibri"/>
+                <w:color w:val="000000" w:themeColor="text1"/>
+                <w:sz w:val="20"/>
+                <w:szCs w:val="20"/>
+                <w:lang w:eastAsia="en-GB"/>
+              </w:rPr>
+              <w:t>via Prolific’s inclusion filters</w:t>
+            </w:r>
+            <w:r>
+              <w:rPr>
+                <w:rFonts w:ascii="Calibri" w:eastAsia="Times New Roman" w:hAnsi="Calibri" w:cs="Calibri"/>
+                <w:color w:val="000000" w:themeColor="text1"/>
+                <w:sz w:val="20"/>
+                <w:szCs w:val="20"/>
+                <w:lang w:eastAsia="en-GB"/>
+              </w:rPr>
+              <w:t>.</w:t>
             </w:r>
           </w:p>
           <w:p>
@@ -966,6 +1107,16 @@
                 <w:szCs w:val="20"/>
                 <w:lang w:eastAsia="en-GB"/>
               </w:rPr>
+              <w:t>,</w:t>
+            </w:r>
+            <w:r>
+              <w:rPr>
+                <w:rFonts w:ascii="Calibri" w:eastAsia="Times New Roman" w:hAnsi="Calibri" w:cs="Calibri"/>
+                <w:color w:val="000000" w:themeColor="text1"/>
+                <w:sz w:val="20"/>
+                <w:szCs w:val="20"/>
+                <w:lang w:eastAsia="en-GB"/>
+              </w:rPr>
               <w:t xml:space="preserve"> as shown in the appendix</w:t>
             </w:r>
             <w:r>
@@ -1002,67 +1153,107 @@
                 <w:szCs w:val="20"/>
                 <w:lang w:eastAsia="en-GB"/>
               </w:rPr>
-              <w:t xml:space="preserve">In the instructions, participants will be reminded of the previous experiment, where they evaluated artworks (aesthetic judgement and thoughts on accuracy of labels preceded by artworks claimed as the following: human-made original, AI-generated </w:t>
-            </w:r>
-            <w:r>
-              <w:rPr>
-                <w:rFonts w:ascii="Calibri" w:eastAsia="Times New Roman" w:hAnsi="Calibri" w:cs="Calibri"/>
-                <w:color w:val="000000" w:themeColor="text1"/>
-                <w:sz w:val="20"/>
-                <w:szCs w:val="20"/>
-                <w:lang w:eastAsia="en-GB"/>
-              </w:rPr>
-              <w:t>original, human-made forg</w:t>
-            </w:r>
-            <w:r>
-              <w:rPr>
-                <w:rFonts w:ascii="Calibri" w:eastAsia="Times New Roman" w:hAnsi="Calibri" w:cs="Calibri"/>
-                <w:color w:val="000000" w:themeColor="text1"/>
-                <w:sz w:val="20"/>
-                <w:szCs w:val="20"/>
-                <w:lang w:eastAsia="en-GB"/>
-              </w:rPr>
-              <w:t>ery</w:t>
-            </w:r>
-            <w:r>
-              <w:rPr>
-                <w:rFonts w:ascii="Calibri" w:eastAsia="Times New Roman" w:hAnsi="Calibri" w:cs="Calibri"/>
-                <w:color w:val="000000" w:themeColor="text1"/>
-                <w:sz w:val="20"/>
-                <w:szCs w:val="20"/>
-                <w:lang w:eastAsia="en-GB"/>
-              </w:rPr>
-              <w:t xml:space="preserve">, </w:t>
-            </w:r>
-            <w:r>
-              <w:rPr>
-                <w:rFonts w:ascii="Calibri" w:eastAsia="Times New Roman" w:hAnsi="Calibri" w:cs="Calibri"/>
-                <w:color w:val="000000" w:themeColor="text1"/>
-                <w:sz w:val="20"/>
-                <w:szCs w:val="20"/>
-                <w:lang w:eastAsia="en-GB"/>
-              </w:rPr>
-              <w:t>ai-generated</w:t>
-            </w:r>
-            <w:r>
-              <w:rPr>
-                <w:rFonts w:ascii="Calibri" w:eastAsia="Times New Roman" w:hAnsi="Calibri" w:cs="Calibri"/>
-                <w:color w:val="000000" w:themeColor="text1"/>
-                <w:sz w:val="20"/>
-                <w:szCs w:val="20"/>
-                <w:lang w:eastAsia="en-GB"/>
-              </w:rPr>
-              <w:t xml:space="preserve"> forgery.</w:t>
-            </w:r>
-            <w:r>
-              <w:rPr>
-                <w:rFonts w:ascii="Calibri" w:eastAsia="Times New Roman" w:hAnsi="Calibri" w:cs="Calibri"/>
-                <w:color w:val="000000" w:themeColor="text1"/>
-                <w:sz w:val="20"/>
-                <w:szCs w:val="20"/>
-                <w:lang w:eastAsia="en-GB"/>
-              </w:rPr>
-              <w:t xml:space="preserve"> They will then be instructed on what they will be doing for this follow-up.</w:t>
+              <w:t>In the instructions, participants will be reminded of the previous experiment, where they evaluated artworks (aesthetic judgement and thoughts on accuracy of labels</w:t>
+            </w:r>
+            <w:r>
+              <w:rPr>
+                <w:rFonts w:ascii="Calibri" w:eastAsia="Times New Roman" w:hAnsi="Calibri" w:cs="Calibri"/>
+                <w:color w:val="000000" w:themeColor="text1"/>
+                <w:sz w:val="20"/>
+                <w:szCs w:val="20"/>
+                <w:lang w:eastAsia="en-GB"/>
+              </w:rPr>
+              <w:t xml:space="preserve"> (subjective reality beliefs)</w:t>
+            </w:r>
+            <w:r>
+              <w:rPr>
+                <w:rFonts w:ascii="Calibri" w:eastAsia="Times New Roman" w:hAnsi="Calibri" w:cs="Calibri"/>
+                <w:color w:val="000000" w:themeColor="text1"/>
+                <w:sz w:val="20"/>
+                <w:szCs w:val="20"/>
+                <w:lang w:eastAsia="en-GB"/>
+              </w:rPr>
+              <w:t xml:space="preserve"> preceded by artworks claimed as the following: </w:t>
+            </w:r>
+            <w:r>
+              <w:rPr>
+                <w:rFonts w:ascii="Calibri" w:eastAsia="Times New Roman" w:hAnsi="Calibri" w:cs="Calibri"/>
+                <w:color w:val="000000" w:themeColor="text1"/>
+                <w:sz w:val="20"/>
+                <w:szCs w:val="20"/>
+                <w:lang w:eastAsia="en-GB"/>
+              </w:rPr>
+              <w:t>Original, AI-Generated, or Human Forgery).</w:t>
+            </w:r>
+            <w:r>
+              <w:rPr>
+                <w:rFonts w:ascii="Calibri" w:eastAsia="Times New Roman" w:hAnsi="Calibri" w:cs="Calibri"/>
+                <w:color w:val="000000" w:themeColor="text1"/>
+                <w:sz w:val="20"/>
+                <w:szCs w:val="20"/>
+                <w:lang w:eastAsia="en-GB"/>
+              </w:rPr>
+              <w:t xml:space="preserve"> </w:t>
+            </w:r>
+            <w:r>
+              <w:rPr>
+                <w:rFonts w:ascii="Calibri" w:eastAsia="Times New Roman" w:hAnsi="Calibri" w:cs="Calibri"/>
+                <w:color w:val="000000" w:themeColor="text1"/>
+                <w:sz w:val="20"/>
+                <w:szCs w:val="20"/>
+                <w:lang w:eastAsia="en-GB"/>
+              </w:rPr>
+              <w:t>Participants</w:t>
+            </w:r>
+            <w:r>
+              <w:rPr>
+                <w:rFonts w:ascii="Calibri" w:eastAsia="Times New Roman" w:hAnsi="Calibri" w:cs="Calibri"/>
+                <w:color w:val="000000" w:themeColor="text1"/>
+                <w:sz w:val="20"/>
+                <w:szCs w:val="20"/>
+                <w:lang w:eastAsia="en-GB"/>
+              </w:rPr>
+              <w:t xml:space="preserve"> will then be instructed on what they will be doing for this follow-up</w:t>
+            </w:r>
+            <w:r>
+              <w:rPr>
+                <w:rFonts w:ascii="Calibri" w:eastAsia="Times New Roman" w:hAnsi="Calibri" w:cs="Calibri"/>
+                <w:color w:val="000000" w:themeColor="text1"/>
+                <w:sz w:val="20"/>
+                <w:szCs w:val="20"/>
+                <w:lang w:eastAsia="en-GB"/>
+              </w:rPr>
+              <w:t xml:space="preserve"> experiment</w:t>
+            </w:r>
+            <w:r>
+              <w:rPr>
+                <w:rFonts w:ascii="Calibri" w:eastAsia="Times New Roman" w:hAnsi="Calibri" w:cs="Calibri"/>
+                <w:color w:val="000000" w:themeColor="text1"/>
+                <w:sz w:val="20"/>
+                <w:szCs w:val="20"/>
+                <w:lang w:eastAsia="en-GB"/>
+              </w:rPr>
+              <w:t xml:space="preserve">, which includes rating both previously seen, as well as new, artworks on </w:t>
+            </w:r>
+            <w:r>
+              <w:rPr>
+                <w:rFonts w:ascii="Calibri" w:eastAsia="Times New Roman" w:hAnsi="Calibri" w:cs="Calibri"/>
+                <w:color w:val="000000" w:themeColor="text1"/>
+                <w:sz w:val="20"/>
+                <w:szCs w:val="20"/>
+                <w:lang w:eastAsia="en-GB"/>
+              </w:rPr>
+              <w:t xml:space="preserve">scales relating to </w:t>
+            </w:r>
+            <w:r>
+              <w:rPr>
+                <w:rFonts w:ascii="Calibri" w:eastAsia="Times New Roman" w:hAnsi="Calibri" w:cs="Calibri"/>
+                <w:color w:val="000000" w:themeColor="text1"/>
+                <w:sz w:val="20"/>
+                <w:szCs w:val="20"/>
+                <w:lang w:eastAsia="en-GB"/>
+              </w:rPr>
+              <w:t>(1) beauty and self-relevance, (2) recognition, and (3) memory.</w:t>
             </w:r>
           </w:p>
           <w:p>
@@ -1088,7 +1279,47 @@
                 <w:szCs w:val="20"/>
                 <w:lang w:eastAsia="en-GB"/>
               </w:rPr>
-              <w:t>A sequential presentation of artworks (previously seen and new</w:t>
+              <w:t xml:space="preserve">A </w:t>
+            </w:r>
+            <w:r>
+              <w:rPr>
+                <w:rFonts w:ascii="Calibri" w:eastAsia="Times New Roman" w:hAnsi="Calibri" w:cs="Calibri"/>
+                <w:color w:val="000000" w:themeColor="text1"/>
+                <w:sz w:val="20"/>
+                <w:szCs w:val="20"/>
+                <w:lang w:eastAsia="en-GB"/>
+              </w:rPr>
+              <w:t>self-paced</w:t>
+            </w:r>
+            <w:r>
+              <w:rPr>
+                <w:rFonts w:ascii="Calibri" w:eastAsia="Times New Roman" w:hAnsi="Calibri" w:cs="Calibri"/>
+                <w:color w:val="000000" w:themeColor="text1"/>
+                <w:sz w:val="20"/>
+                <w:szCs w:val="20"/>
+                <w:lang w:eastAsia="en-GB"/>
+              </w:rPr>
+              <w:t xml:space="preserve"> presentation of </w:t>
+            </w:r>
+            <w:r>
+              <w:rPr>
+                <w:rFonts w:ascii="Calibri" w:eastAsia="Times New Roman" w:hAnsi="Calibri" w:cs="Calibri"/>
+                <w:color w:val="000000" w:themeColor="text1"/>
+                <w:sz w:val="20"/>
+                <w:szCs w:val="20"/>
+                <w:lang w:eastAsia="en-GB"/>
+              </w:rPr>
+              <w:t xml:space="preserve">96 </w:t>
+            </w:r>
+            <w:r>
+              <w:rPr>
+                <w:rFonts w:ascii="Calibri" w:eastAsia="Times New Roman" w:hAnsi="Calibri" w:cs="Calibri"/>
+                <w:color w:val="000000" w:themeColor="text1"/>
+                <w:sz w:val="20"/>
+                <w:szCs w:val="20"/>
+                <w:lang w:eastAsia="en-GB"/>
+              </w:rPr>
+              <w:t>artworks (previously seen and new</w:t>
             </w:r>
             <w:r>
               <w:rPr>
@@ -1108,77 +1339,227 @@
                 <w:szCs w:val="20"/>
                 <w:lang w:eastAsia="en-GB"/>
               </w:rPr>
-              <w:t>, each artwork followed by recognition (“I recognise this artwork from the previous study”, Yes/No) and label recall feedback forms (</w:t>
-            </w:r>
-            <w:r>
-              <w:rPr>
-                <w:rFonts w:ascii="Calibri" w:eastAsia="Times New Roman" w:hAnsi="Calibri" w:cs="Calibri"/>
-                <w:color w:val="000000" w:themeColor="text1"/>
-                <w:sz w:val="20"/>
-                <w:szCs w:val="20"/>
-                <w:lang w:eastAsia="en-GB"/>
-              </w:rPr>
-              <w:t xml:space="preserve">participants </w:t>
-            </w:r>
-            <w:r>
-              <w:rPr>
-                <w:rFonts w:ascii="Calibri" w:eastAsia="Times New Roman" w:hAnsi="Calibri" w:cs="Calibri"/>
-                <w:color w:val="000000" w:themeColor="text1"/>
-                <w:sz w:val="20"/>
-                <w:szCs w:val="20"/>
-                <w:lang w:eastAsia="en-GB"/>
-              </w:rPr>
-              <w:t xml:space="preserve">identify what </w:t>
-            </w:r>
-            <w:r>
-              <w:rPr>
-                <w:rFonts w:ascii="Calibri" w:eastAsia="Times New Roman" w:hAnsi="Calibri" w:cs="Calibri"/>
-                <w:color w:val="000000" w:themeColor="text1"/>
-                <w:sz w:val="20"/>
-                <w:szCs w:val="20"/>
-                <w:lang w:eastAsia="en-GB"/>
-              </w:rPr>
-              <w:t>labels each artwork was claimed to be</w:t>
-            </w:r>
-            <w:r>
-              <w:rPr>
-                <w:rFonts w:ascii="Calibri" w:eastAsia="Times New Roman" w:hAnsi="Calibri" w:cs="Calibri"/>
-                <w:color w:val="000000" w:themeColor="text1"/>
-                <w:sz w:val="20"/>
-                <w:szCs w:val="20"/>
-                <w:lang w:eastAsia="en-GB"/>
-              </w:rPr>
-              <w:t>,</w:t>
-            </w:r>
-            <w:r>
-              <w:rPr>
-                <w:rFonts w:ascii="Calibri" w:eastAsia="Times New Roman" w:hAnsi="Calibri" w:cs="Calibri"/>
-                <w:color w:val="000000" w:themeColor="text1"/>
-                <w:sz w:val="20"/>
-                <w:szCs w:val="20"/>
-                <w:lang w:eastAsia="en-GB"/>
-              </w:rPr>
-              <w:t xml:space="preserve"> and the labels the participants believed them to be in the previous experiment</w:t>
-            </w:r>
-            <w:r>
-              <w:rPr>
-                <w:rFonts w:ascii="Calibri" w:eastAsia="Times New Roman" w:hAnsi="Calibri" w:cs="Calibri"/>
-                <w:color w:val="000000" w:themeColor="text1"/>
-                <w:sz w:val="20"/>
-                <w:szCs w:val="20"/>
-                <w:lang w:eastAsia="en-GB"/>
-              </w:rPr>
-              <w:t>). These</w:t>
-            </w:r>
-            <w:r>
-              <w:rPr>
-                <w:rFonts w:ascii="Calibri" w:eastAsia="Times New Roman" w:hAnsi="Calibri" w:cs="Calibri"/>
-                <w:color w:val="000000" w:themeColor="text1"/>
-                <w:sz w:val="20"/>
-                <w:szCs w:val="20"/>
-                <w:lang w:eastAsia="en-GB"/>
-              </w:rPr>
-              <w:t xml:space="preserve"> labels consist of Human-Created Original, AI-Generated Original, Human-Created Forgery and AI-Generated Forgery).</w:t>
+              <w:t>. Participants will firstly rate each artwork according to its perceived Beauty (</w:t>
+            </w:r>
+            <w:r>
+              <w:rPr>
+                <w:rFonts w:ascii="Calibri" w:eastAsia="Times New Roman" w:hAnsi="Calibri" w:cs="Calibri"/>
+                <w:color w:val="000000" w:themeColor="text1"/>
+                <w:sz w:val="20"/>
+                <w:szCs w:val="20"/>
+                <w:lang w:eastAsia="en-GB"/>
+              </w:rPr>
+              <w:t xml:space="preserve">on a sliding scale, </w:t>
+            </w:r>
+            <w:r>
+              <w:rPr>
+                <w:rFonts w:ascii="Calibri" w:eastAsia="Times New Roman" w:hAnsi="Calibri" w:cs="Calibri"/>
+                <w:color w:val="000000" w:themeColor="text1"/>
+                <w:sz w:val="20"/>
+                <w:szCs w:val="20"/>
+                <w:lang w:eastAsia="en-GB"/>
+              </w:rPr>
+              <w:t>from “Ugly” to “Beautiful”) and Self-Relevance (</w:t>
+            </w:r>
+            <w:r>
+              <w:rPr>
+                <w:rFonts w:ascii="Calibri" w:eastAsia="Times New Roman" w:hAnsi="Calibri" w:cs="Calibri"/>
+                <w:color w:val="000000" w:themeColor="text1"/>
+                <w:sz w:val="20"/>
+                <w:szCs w:val="20"/>
+                <w:lang w:eastAsia="en-GB"/>
+              </w:rPr>
+              <w:t>“This painting is personally relevant…”</w:t>
+            </w:r>
+            <w:r>
+              <w:rPr>
+                <w:rFonts w:ascii="Calibri" w:eastAsia="Times New Roman" w:hAnsi="Calibri" w:cs="Calibri"/>
+                <w:color w:val="000000" w:themeColor="text1"/>
+                <w:sz w:val="20"/>
+                <w:szCs w:val="20"/>
+                <w:lang w:eastAsia="en-GB"/>
+              </w:rPr>
+              <w:t xml:space="preserve">, </w:t>
+            </w:r>
+            <w:r>
+              <w:rPr>
+                <w:rFonts w:ascii="Calibri" w:eastAsia="Times New Roman" w:hAnsi="Calibri" w:cs="Calibri"/>
+                <w:color w:val="000000" w:themeColor="text1"/>
+                <w:sz w:val="20"/>
+                <w:szCs w:val="20"/>
+                <w:lang w:eastAsia="en-GB"/>
+              </w:rPr>
+              <w:t>Not at all–Very much</w:t>
+            </w:r>
+            <w:r>
+              <w:rPr>
+                <w:rFonts w:ascii="Calibri" w:eastAsia="Times New Roman" w:hAnsi="Calibri" w:cs="Calibri"/>
+                <w:color w:val="000000" w:themeColor="text1"/>
+                <w:sz w:val="20"/>
+                <w:szCs w:val="20"/>
+                <w:lang w:eastAsia="en-GB"/>
+              </w:rPr>
+              <w:t>).</w:t>
+            </w:r>
+            <w:r>
+              <w:rPr>
+                <w:rFonts w:ascii="Calibri" w:eastAsia="Times New Roman" w:hAnsi="Calibri" w:cs="Calibri"/>
+                <w:color w:val="000000" w:themeColor="text1"/>
+                <w:sz w:val="20"/>
+                <w:szCs w:val="20"/>
+                <w:lang w:eastAsia="en-GB"/>
+              </w:rPr>
+              <w:t xml:space="preserve"> </w:t>
+            </w:r>
+            <w:r>
+              <w:rPr>
+                <w:rFonts w:ascii="Calibri" w:eastAsia="Times New Roman" w:hAnsi="Calibri" w:cs="Calibri"/>
+                <w:color w:val="000000" w:themeColor="text1"/>
+                <w:sz w:val="20"/>
+                <w:szCs w:val="20"/>
+                <w:lang w:eastAsia="en-GB"/>
+              </w:rPr>
+              <w:t>E</w:t>
+            </w:r>
+            <w:r>
+              <w:rPr>
+                <w:rFonts w:ascii="Calibri" w:eastAsia="Times New Roman" w:hAnsi="Calibri" w:cs="Calibri"/>
+                <w:color w:val="000000" w:themeColor="text1"/>
+                <w:sz w:val="20"/>
+                <w:szCs w:val="20"/>
+                <w:lang w:eastAsia="en-GB"/>
+              </w:rPr>
+              <w:t xml:space="preserve">ach artwork </w:t>
+            </w:r>
+            <w:r>
+              <w:rPr>
+                <w:rFonts w:ascii="Calibri" w:eastAsia="Times New Roman" w:hAnsi="Calibri" w:cs="Calibri"/>
+                <w:color w:val="000000" w:themeColor="text1"/>
+                <w:sz w:val="20"/>
+                <w:szCs w:val="20"/>
+                <w:lang w:eastAsia="en-GB"/>
+              </w:rPr>
+              <w:t xml:space="preserve">is then </w:t>
+            </w:r>
+            <w:r>
+              <w:rPr>
+                <w:rFonts w:ascii="Calibri" w:eastAsia="Times New Roman" w:hAnsi="Calibri" w:cs="Calibri"/>
+                <w:color w:val="000000" w:themeColor="text1"/>
+                <w:sz w:val="20"/>
+                <w:szCs w:val="20"/>
+                <w:lang w:eastAsia="en-GB"/>
+              </w:rPr>
+              <w:t xml:space="preserve">followed by </w:t>
+            </w:r>
+            <w:r>
+              <w:rPr>
+                <w:rFonts w:ascii="Calibri" w:eastAsia="Times New Roman" w:hAnsi="Calibri" w:cs="Calibri"/>
+                <w:color w:val="000000" w:themeColor="text1"/>
+                <w:sz w:val="20"/>
+                <w:szCs w:val="20"/>
+                <w:lang w:eastAsia="en-GB"/>
+              </w:rPr>
+              <w:t xml:space="preserve">a </w:t>
+            </w:r>
+            <w:r>
+              <w:rPr>
+                <w:rFonts w:ascii="Calibri" w:eastAsia="Times New Roman" w:hAnsi="Calibri" w:cs="Calibri"/>
+                <w:color w:val="000000" w:themeColor="text1"/>
+                <w:sz w:val="20"/>
+                <w:szCs w:val="20"/>
+                <w:lang w:eastAsia="en-GB"/>
+              </w:rPr>
+              <w:t>recognition</w:t>
+            </w:r>
+            <w:r>
+              <w:rPr>
+                <w:rFonts w:ascii="Calibri" w:eastAsia="Times New Roman" w:hAnsi="Calibri" w:cs="Calibri"/>
+                <w:color w:val="000000" w:themeColor="text1"/>
+                <w:sz w:val="20"/>
+                <w:szCs w:val="20"/>
+                <w:lang w:eastAsia="en-GB"/>
+              </w:rPr>
+              <w:t xml:space="preserve"> question</w:t>
+            </w:r>
+            <w:r>
+              <w:rPr>
+                <w:rFonts w:ascii="Calibri" w:eastAsia="Times New Roman" w:hAnsi="Calibri" w:cs="Calibri"/>
+                <w:color w:val="000000" w:themeColor="text1"/>
+                <w:sz w:val="20"/>
+                <w:szCs w:val="20"/>
+                <w:lang w:eastAsia="en-GB"/>
+              </w:rPr>
+              <w:t xml:space="preserve"> (“I recognise this artwork from the previous study”, Yes/No)</w:t>
+            </w:r>
+            <w:r>
+              <w:rPr>
+                <w:rFonts w:ascii="Calibri" w:eastAsia="Times New Roman" w:hAnsi="Calibri" w:cs="Calibri"/>
+                <w:color w:val="000000" w:themeColor="text1"/>
+                <w:sz w:val="20"/>
+                <w:szCs w:val="20"/>
+                <w:lang w:eastAsia="en-GB"/>
+              </w:rPr>
+              <w:t>: (1) if “Yes”, participants must state which label the stimulus was assigned in the previous study as per the reality beliefs modulation (Original/AI-Generated/Human Forgery) and will also be asked to remember their subjective reality belief</w:t>
+            </w:r>
+            <w:r>
+              <w:rPr>
+                <w:rFonts w:ascii="Calibri" w:eastAsia="Times New Roman" w:hAnsi="Calibri" w:cs="Calibri"/>
+                <w:color w:val="000000" w:themeColor="text1"/>
+                <w:sz w:val="20"/>
+                <w:szCs w:val="20"/>
+                <w:lang w:eastAsia="en-GB"/>
+              </w:rPr>
+              <w:t>s</w:t>
+            </w:r>
+            <w:r>
+              <w:rPr>
+                <w:rFonts w:ascii="Calibri" w:eastAsia="Times New Roman" w:hAnsi="Calibri" w:cs="Calibri"/>
+                <w:color w:val="000000" w:themeColor="text1"/>
+                <w:sz w:val="20"/>
+                <w:szCs w:val="20"/>
+                <w:lang w:eastAsia="en-GB"/>
+              </w:rPr>
+              <w:t xml:space="preserve"> about the stimulus </w:t>
+            </w:r>
+            <w:r>
+              <w:rPr>
+                <w:rFonts w:ascii="Calibri" w:eastAsia="Times New Roman" w:hAnsi="Calibri" w:cs="Calibri"/>
+                <w:color w:val="000000" w:themeColor="text1"/>
+                <w:sz w:val="20"/>
+                <w:szCs w:val="20"/>
+                <w:lang w:eastAsia="en-GB"/>
+              </w:rPr>
+              <w:t xml:space="preserve">from the previous study </w:t>
+            </w:r>
+            <w:r>
+              <w:rPr>
+                <w:rFonts w:ascii="Calibri" w:eastAsia="Times New Roman" w:hAnsi="Calibri" w:cs="Calibri"/>
+                <w:color w:val="000000" w:themeColor="text1"/>
+                <w:sz w:val="20"/>
+                <w:szCs w:val="20"/>
+                <w:lang w:eastAsia="en-GB"/>
+              </w:rPr>
+              <w:t>(Human Original/Human Forgery/AI Original/AI Copy); (2) if “No”, participants are only further asked to rate the perceived AI-likeness of the artwork, in terms of the ease of which they could believe the artwork was created by AI (</w:t>
+            </w:r>
+            <w:r>
+              <w:rPr>
+                <w:rFonts w:ascii="Calibri" w:eastAsia="Times New Roman" w:hAnsi="Calibri" w:cs="Calibri"/>
+                <w:color w:val="000000" w:themeColor="text1"/>
+                <w:sz w:val="20"/>
+                <w:szCs w:val="20"/>
+                <w:lang w:eastAsia="en-GB"/>
+              </w:rPr>
+              <w:t xml:space="preserve">on a sliding scale, </w:t>
+            </w:r>
+            <w:r>
+              <w:rPr>
+                <w:rFonts w:ascii="Calibri" w:eastAsia="Times New Roman" w:hAnsi="Calibri" w:cs="Calibri"/>
+                <w:color w:val="000000" w:themeColor="text1"/>
+                <w:sz w:val="20"/>
+                <w:szCs w:val="20"/>
+                <w:lang w:eastAsia="en-GB"/>
+              </w:rPr>
+              <w:t>from “Not at all” to “Very much”).</w:t>
             </w:r>
           </w:p>
           <w:p>
@@ -1202,78 +1583,48 @@
                 <w:szCs w:val="20"/>
                 <w:lang w:eastAsia="en-GB"/>
               </w:rPr>
-              <w:t xml:space="preserve">A Debrief – the participants will be debriefed with a summary of the aim and hypothesis of this experiment. </w:t>
+              <w:t xml:space="preserve">A </w:t>
+            </w:r>
+            <w:r>
+              <w:rPr>
+                <w:rFonts w:ascii="Calibri" w:eastAsia="Times New Roman" w:hAnsi="Calibri" w:cs="Calibri"/>
+                <w:sz w:val="20"/>
+                <w:szCs w:val="20"/>
+                <w:lang w:eastAsia="en-GB"/>
+              </w:rPr>
+              <w:t>D</w:t>
+            </w:r>
+            <w:r>
+              <w:rPr>
+                <w:rFonts w:ascii="Calibri" w:eastAsia="Times New Roman" w:hAnsi="Calibri" w:cs="Calibri"/>
+                <w:sz w:val="20"/>
+                <w:szCs w:val="20"/>
+                <w:lang w:eastAsia="en-GB"/>
+              </w:rPr>
+              <w:t>ebrief – the participants will be debriefed with a summary of the aim and</w:t>
+            </w:r>
+            <w:r>
+              <w:rPr>
+                <w:rFonts w:ascii="Calibri" w:eastAsia="Times New Roman" w:hAnsi="Calibri" w:cs="Calibri"/>
+                <w:sz w:val="20"/>
+                <w:szCs w:val="20"/>
+                <w:lang w:eastAsia="en-GB"/>
+              </w:rPr>
+              <w:t xml:space="preserve"> primary</w:t>
+            </w:r>
+            <w:r>
+              <w:rPr>
+                <w:rFonts w:ascii="Calibri" w:eastAsia="Times New Roman" w:hAnsi="Calibri" w:cs="Calibri"/>
+                <w:sz w:val="20"/>
+                <w:szCs w:val="20"/>
+                <w:lang w:eastAsia="en-GB"/>
+              </w:rPr>
+              <w:t xml:space="preserve"> hypothesis of this experiment. </w:t>
             </w:r>
           </w:p>
         </w:tc>
       </w:tr>
     </w:tbl>
-    <w:p>
-      <w:pPr>
-        <w:spacing w:line="276" w:lineRule="auto"/>
-        <w:rPr>
-          <w:rFonts w:ascii="Calibri" w:eastAsia="Times New Roman" w:hAnsi="Calibri" w:cs="Calibri"/>
-          <w:sz w:val="20"/>
-          <w:szCs w:val="20"/>
-          <w:lang w:eastAsia="en-GB"/>
-        </w:rPr>
-      </w:pPr>
-    </w:p>
-    <w:p>
-      <w:pPr>
-        <w:spacing w:line="276" w:lineRule="auto"/>
-        <w:rPr>
-          <w:rFonts w:ascii="Calibri" w:eastAsia="Times New Roman" w:hAnsi="Calibri" w:cs="Calibri"/>
-          <w:sz w:val="20"/>
-          <w:szCs w:val="20"/>
-          <w:lang w:eastAsia="en-GB"/>
-        </w:rPr>
-      </w:pPr>
-    </w:p>
-    <w:p>
-      <w:pPr>
-        <w:spacing w:line="276" w:lineRule="auto"/>
-        <w:rPr>
-          <w:rFonts w:ascii="Calibri" w:eastAsia="Times New Roman" w:hAnsi="Calibri" w:cs="Calibri"/>
-          <w:sz w:val="20"/>
-          <w:szCs w:val="20"/>
-          <w:lang w:eastAsia="en-GB"/>
-        </w:rPr>
-      </w:pPr>
-    </w:p>
-    <w:p>
-      <w:pPr>
-        <w:spacing w:line="276" w:lineRule="auto"/>
-        <w:rPr>
-          <w:rFonts w:ascii="Calibri" w:eastAsia="Times New Roman" w:hAnsi="Calibri" w:cs="Calibri"/>
-          <w:sz w:val="20"/>
-          <w:szCs w:val="20"/>
-          <w:lang w:eastAsia="en-GB"/>
-        </w:rPr>
-      </w:pPr>
-    </w:p>
-    <w:p>
-      <w:pPr>
-        <w:spacing w:line="276" w:lineRule="auto"/>
-        <w:rPr>
-          <w:rFonts w:ascii="Calibri" w:eastAsia="Times New Roman" w:hAnsi="Calibri" w:cs="Calibri"/>
-          <w:sz w:val="20"/>
-          <w:szCs w:val="20"/>
-          <w:lang w:eastAsia="en-GB"/>
-        </w:rPr>
-      </w:pPr>
-    </w:p>
-    <w:p>
-      <w:pPr>
-        <w:spacing w:line="276" w:lineRule="auto"/>
-        <w:rPr>
-          <w:rFonts w:ascii="Calibri" w:eastAsia="Times New Roman" w:hAnsi="Calibri" w:cs="Calibri"/>
-          <w:sz w:val="20"/>
-          <w:szCs w:val="20"/>
-          <w:lang w:eastAsia="en-GB"/>
-        </w:rPr>
-      </w:pPr>
-    </w:p>
     <w:p>
       <w:pPr>
         <w:spacing w:line="276" w:lineRule="auto"/>
@@ -1378,6 +1729,7 @@
                 <w:szCs w:val="20"/>
                 <w:lang w:eastAsia="en-GB"/>
               </w:rPr>
+              <w:lastRenderedPageBreak/>
               <w:t>Ethical Review Form Section A</w:t>
             </w:r>
           </w:p>
@@ -2172,6 +2524,7 @@
                 <w:szCs w:val="20"/>
                 <w:lang w:eastAsia="en-GB"/>
               </w:rPr>
+              <w:lastRenderedPageBreak/>
               <w:t>Ethical Review Form Section B</w:t>
             </w:r>
           </w:p>
@@ -2352,7 +2705,25 @@
                 <w:szCs w:val="20"/>
                 <w:lang w:eastAsia="en-GB"/>
               </w:rPr>
-              <w:t>The study will be opened to all the Prolific participants that completed the first experiment.</w:t>
+              <w:t>The study will be opened to all the Prolific participants</w:t>
+            </w:r>
+            <w:r>
+              <w:rPr>
+                <w:rFonts w:ascii="Calibri" w:eastAsia="Times New Roman" w:hAnsi="Calibri" w:cs="Calibri"/>
+                <w:sz w:val="20"/>
+                <w:szCs w:val="20"/>
+                <w:lang w:eastAsia="en-GB"/>
+              </w:rPr>
+              <w:t xml:space="preserve"> who</w:t>
+            </w:r>
+            <w:r>
+              <w:rPr>
+                <w:rFonts w:ascii="Calibri" w:eastAsia="Times New Roman" w:hAnsi="Calibri" w:cs="Calibri"/>
+                <w:sz w:val="20"/>
+                <w:szCs w:val="20"/>
+                <w:lang w:eastAsia="en-GB"/>
+              </w:rPr>
+              <w:t xml:space="preserve"> completed the first experiment.</w:t>
             </w:r>
           </w:p>
         </w:tc>
@@ -2958,8 +3329,17 @@
                 <w:szCs w:val="20"/>
                 <w:lang w:eastAsia="en-GB"/>
               </w:rPr>
+              <w:t xml:space="preserve">B11a. Please explain how ANY identifiable personal and/or research data will be managed and securely stored ensuring </w:t>
+            </w:r>
+            <w:r>
+              <w:rPr>
+                <w:rFonts w:ascii="Calibri" w:eastAsia="Times New Roman" w:hAnsi="Calibri" w:cs="Calibri"/>
+                <w:sz w:val="20"/>
+                <w:szCs w:val="20"/>
+                <w:lang w:eastAsia="en-GB"/>
+              </w:rPr>
               <w:lastRenderedPageBreak/>
-              <w:t>B11a. Please explain how ANY identifiable personal and/or research data will be managed and securely stored ensuring that participants have given appropriate informed consent for this.</w:t>
+              <w:t>that participants have given appropriate informed consent for this.</w:t>
             </w:r>
           </w:p>
         </w:tc>
@@ -3544,27 +3924,7 @@
                 <w:szCs w:val="20"/>
                 <w:lang w:eastAsia="en-GB"/>
               </w:rPr>
-              <w:t>B19. Are any other ethical clearances or permissions (internal or external) required? Please see the help text (</w:t>
-            </w:r>
-            <w:proofErr w:type="spellStart"/>
-            <w:r>
-              <w:rPr>
-                <w:rFonts w:ascii="Calibri" w:eastAsia="Times New Roman" w:hAnsi="Calibri" w:cs="Calibri"/>
-                <w:sz w:val="20"/>
-                <w:szCs w:val="20"/>
-                <w:lang w:eastAsia="en-GB"/>
-              </w:rPr>
-              <w:t>i</w:t>
-            </w:r>
-            <w:proofErr w:type="spellEnd"/>
-            <w:r>
-              <w:rPr>
-                <w:rFonts w:ascii="Calibri" w:eastAsia="Times New Roman" w:hAnsi="Calibri" w:cs="Calibri"/>
-                <w:sz w:val="20"/>
-                <w:szCs w:val="20"/>
-                <w:lang w:eastAsia="en-GB"/>
-              </w:rPr>
-              <w:t>) for further details.</w:t>
+              <w:t>B19. Are any other ethical clearances or permissions (internal or external) required? Please see the help text (i) for further details.</w:t>
             </w:r>
           </w:p>
         </w:tc>
@@ -3617,8 +3977,17 @@
                 <w:szCs w:val="20"/>
                 <w:lang w:eastAsia="en-GB"/>
               </w:rPr>
+              <w:t xml:space="preserve">B19a. If yes, please give further details including the name and address of the organisation. If other ethical approval has already been received please attach evidence of approval, otherwise </w:t>
+            </w:r>
+            <w:r>
+              <w:rPr>
+                <w:rFonts w:ascii="Calibri" w:eastAsia="Times New Roman" w:hAnsi="Calibri" w:cs="Calibri"/>
+                <w:sz w:val="20"/>
+                <w:szCs w:val="20"/>
+                <w:lang w:eastAsia="en-GB"/>
+              </w:rPr>
               <w:lastRenderedPageBreak/>
-              <w:t>B19a. If yes, please give further details including the name and address of the organisation. If other ethical approval has already been received please attach evidence of approval, otherwise you will need to supply it when ready. (You do not need to provide evidence of a current DBS check at this point).</w:t>
+              <w:t>you will need to supply it when ready. (You do not need to provide evidence of a current DBS check at this point).</w:t>
             </w:r>
           </w:p>
         </w:tc>
@@ -3981,6 +4350,86 @@
       </w:tr>
     </w:tbl>
     <w:p/>
+    <w:p/>
+    <w:p/>
+    <w:p/>
+    <w:p/>
+    <w:p/>
+    <w:p/>
+    <w:p/>
+    <w:p/>
+    <w:p/>
+    <w:p/>
+    <w:p>
+      <w:pPr>
+        <w:jc w:val="center"/>
+        <w:rPr>
+          <w:rFonts w:ascii="Calibri" w:hAnsi="Calibri" w:cs="Calibri"/>
+          <w:sz w:val="28"/>
+          <w:szCs w:val="28"/>
+          <w:u w:val="single"/>
+        </w:rPr>
+      </w:pPr>
+    </w:p>
+    <w:p>
+      <w:pPr>
+        <w:jc w:val="center"/>
+        <w:rPr>
+          <w:rFonts w:ascii="Calibri" w:hAnsi="Calibri" w:cs="Calibri"/>
+          <w:sz w:val="28"/>
+          <w:szCs w:val="28"/>
+          <w:u w:val="single"/>
+        </w:rPr>
+      </w:pPr>
+    </w:p>
+    <w:p>
+      <w:pPr>
+        <w:jc w:val="center"/>
+        <w:rPr>
+          <w:rFonts w:ascii="Calibri" w:hAnsi="Calibri" w:cs="Calibri"/>
+          <w:sz w:val="28"/>
+          <w:szCs w:val="28"/>
+          <w:u w:val="single"/>
+        </w:rPr>
+      </w:pPr>
+    </w:p>
+    <w:p>
+      <w:pPr>
+        <w:jc w:val="center"/>
+        <w:rPr>
+          <w:rFonts w:ascii="Calibri" w:hAnsi="Calibri" w:cs="Calibri"/>
+          <w:sz w:val="28"/>
+          <w:szCs w:val="28"/>
+          <w:u w:val="single"/>
+        </w:rPr>
+      </w:pPr>
+    </w:p>
+    <w:p>
+      <w:pPr>
+        <w:jc w:val="center"/>
+        <w:rPr>
+          <w:rFonts w:ascii="Calibri" w:hAnsi="Calibri" w:cs="Calibri"/>
+          <w:u w:val="single"/>
+        </w:rPr>
+      </w:pPr>
+      <w:r>
+        <w:rPr>
+          <w:rFonts w:ascii="Calibri" w:hAnsi="Calibri" w:cs="Calibri"/>
+          <w:u w:val="single"/>
+        </w:rPr>
+        <w:lastRenderedPageBreak/>
+        <w:t>Appendix</w:t>
+      </w:r>
+    </w:p>
+    <w:p>
+      <w:pPr>
+        <w:rPr>
+          <w:rFonts w:ascii="Calibri" w:hAnsi="Calibri" w:cs="Calibri"/>
+          <w:sz w:val="20"/>
+          <w:szCs w:val="20"/>
+        </w:rPr>
+      </w:pPr>
+    </w:p>
     <w:sectPr>
       <w:pgSz w:w="11906" w:h="16838"/>
       <w:pgMar w:top="1440" w:right="1440" w:bottom="1440" w:left="1440" w:header="708" w:footer="708" w:gutter="0"/>
@@ -4160,14 +4609,6 @@
     <w:abstractNumId w:val="0"/>
   </w:num>
 </w:numbering>
-</file>
-
-<file path=word/people.xml><?xml version="1.0" encoding="utf-8"?>
-<w15:people xmlns:wpc="http://schemas.microsoft.com/office/word/2010/wordprocessingCanvas" xmlns:cx="http://schemas.microsoft.com/office/drawing/2014/chartex" xmlns:cx1="http://schemas.microsoft.com/office/drawing/2015/9/8/chartex" xmlns:cx2="http://schemas.microsoft.com/office/drawing/2015/10/21/chartex" xmlns:cx3="http://schemas.microsoft.com/office/drawing/2016/5/9/chartex" xmlns:cx4="http://schemas.microsoft.com/office/drawing/2016/5/10/chartex" xmlns:cx5="http://schemas.microsoft.com/office/drawing/2016/5/11/chartex" xmlns:cx6="http://schemas.microsoft.com/office/drawing/2016/5/12/chartex" xmlns:cx7="http://schemas.microsoft.com/office/drawing/2016/5/13/chartex" xmlns:cx8="http://schemas.microsoft.com/office/drawing/2016/5/14/chartex" xmlns:mc="http://schemas.openxmlformats.org/markup-compatibility/2006" xmlns:aink="http://schemas.microsoft.com/office/drawing/2016/ink" xmlns:am3d="http://schemas.microsoft.com/office/drawing/2017/model3d" xmlns:o="urn:schemas-microsoft-com:office:office" xmlns:oel="http://schemas.microsoft.com/office/2019/extlst" xmlns:r="http://schemas.openxmlformats.org/officeDocument/2006/relationships" xmlns:m="http://schemas.openxmlformats.org/officeDocument/2006/math" xmlns:v="urn:schemas-microsoft-com:vml" xmlns:wp14="http://schemas.microsoft.com/office/word/2010/wordprocessingDrawing" xmlns:wp="http://schemas.openxmlformats.org/drawingml/2006/wordprocessingDrawing" xmlns:w10="urn:schemas-microsoft-com:office:word" xmlns:w="http://schemas.openxmlformats.org/wordprocessingml/2006/main" xmlns:w14="http://schemas.microsoft.com/office/word/2010/wordml" xmlns:w15="http://schemas.microsoft.com/office/word/2012/wordml" xmlns:w16cex="http://schemas.microsoft.com/office/word/2018/wordml/cex" xmlns:w16cid="http://schemas.microsoft.com/office/word/2016/wordml/cid" xmlns:w16="http://schemas.microsoft.com/office/word/2018/wordml" xmlns:w16du="http://schemas.microsoft.com/office/word/2023/wordml/word16du" xmlns:w16sdtdh="http://schemas.microsoft.com/office/word/2020/wordml/sdtdatahash" xmlns:w16sdtfl="http://schemas.microsoft.com/office/word/2024/wordml/sdtformatlock" xmlns:w16se="http://schemas.microsoft.com/office/word/2015/wordml/symex" xmlns:wpg="http://schemas.microsoft.com/office/word/2010/wordprocessingGroup" xmlns:wpi="http://schemas.microsoft.com/office/word/2010/wordprocessingInk" xmlns:wne="http://schemas.microsoft.com/office/word/2006/wordml" xmlns:wps="http://schemas.microsoft.com/office/word/2010/wordprocessingShape" mc:Ignorable="w14 w15 w16se w16cid w16 w16cex w16sdtdh w16sdtfl w16du wp14">
-  <w15:person w15:author="Dominique Makowski">
-    <w15:presenceInfo w15:providerId="AD" w15:userId="S::dmm56@sussex.ac.uk::55f4f0e0-3f37-4f46-a528-296a38a344bf"/>
-  </w15:person>
-</w15:people>
 </file>
 
 <file path=word/styles.xml><?xml version="1.0" encoding="utf-8"?>

</xml_diff>